<commit_message>
docs(copilot-v2): add UI API response fixture and sync docx
Made-with: Cursor
</commit_message>
<xml_diff>
--- a/copilot-v2/docs/MODEL_TRAINING_AND_RESULTS.docx
+++ b/copilot-v2/docs/MODEL_TRAINING_AND_RESULTS.docx
@@ -9193,7 +9193,489 @@
         <w:pStyle w:val="Heading2"/>
       </w:pPr>
       <w:r>
-        <w:t>4. Changelog</w:t>
+        <w:t>4. Debate replay evaluation (ACJ debate layer)</w:t>
+      </w:r>
+    </w:p>
+    <w:p>
+      <w:r>
+        <w:t>This section evaluates the Advocate → Critic → Judge (ACJ) debate layer in isolation by replaying cached specialist inputs (retrieval + pricing + sentiment + inventory signals).</w:t>
+      </w:r>
+    </w:p>
+    <w:p>
+      <w:pPr>
+        <w:pStyle w:val="Heading3"/>
+      </w:pPr>
+      <w:r>
+        <w:t>4.1 Smoke run — full 27 combinations (5 goals)</w:t>
+      </w:r>
+    </w:p>
+    <w:p>
+      <w:pPr>
+        <w:pStyle w:val="ListBullet"/>
+      </w:pPr>
+      <w:r>
+        <w:t>Snapshot: 38710839ca6e1009</w:t>
+      </w:r>
+    </w:p>
+    <w:p>
+      <w:pPr>
+        <w:pStyle w:val="ListBullet"/>
+      </w:pPr>
+      <w:r>
+        <w:t>Owner: store_00</w:t>
+      </w:r>
+    </w:p>
+    <w:p>
+      <w:pPr>
+        <w:pStyle w:val="ListBullet"/>
+      </w:pPr>
+      <w:r>
+        <w:t>Cached inputs: copilot-v2/artifacts/evals/38710839ca6e1009/debate_replay/20260415_110516/specialist_inputs.jsonl</w:t>
+      </w:r>
+    </w:p>
+    <w:p>
+      <w:pPr>
+        <w:pStyle w:val="ListBullet"/>
+      </w:pPr>
+      <w:r>
+        <w:t>Replay summary: copilot-v2/artifacts/evals/38710839ca6e1009/debate_replay/20260415_110516/replay_results_27/summary.json</w:t>
+      </w:r>
+    </w:p>
+    <w:p>
+      <w:pPr>
+        <w:pStyle w:val="ListBullet"/>
+      </w:pPr>
+      <w:r>
+        <w:t>Outcome: debate_ok_rate=1.00 for all combos on the 5-goal smoke set.</w:t>
+      </w:r>
+    </w:p>
+    <w:p>
+      <w:pPr>
+        <w:pStyle w:val="Heading3"/>
+      </w:pPr>
+      <w:r>
+        <w:t>4.2 Narrowed replay — 8 combinations (20 goals)</w:t>
+      </w:r>
+    </w:p>
+    <w:p>
+      <w:pPr>
+        <w:pStyle w:val="ListBullet"/>
+      </w:pPr>
+      <w:r>
+        <w:t>Cached inputs: copilot-v2/artifacts/evals/38710839ca6e1009/debate_replay/20260415_115235/specialist_inputs.jsonl</w:t>
+      </w:r>
+    </w:p>
+    <w:p>
+      <w:pPr>
+        <w:pStyle w:val="ListBullet"/>
+      </w:pPr>
+      <w:r>
+        <w:t>Replay summary: copilot-v2/artifacts/evals/38710839ca6e1009/debate_replay/20260415_115235/replay_results_8x20/summary.json</w:t>
+      </w:r>
+    </w:p>
+    <w:p>
+      <w:pPr>
+        <w:pStyle w:val="ListBullet"/>
+      </w:pPr>
+      <w:r>
+        <w:t>Recommended default ACJ (20-goal run): llama3.1:8b | qwen2.5:7b-instruct | qwen2.5:7b-instruct</w:t>
+      </w:r>
+    </w:p>
+    <w:p>
+      <w:pPr>
+        <w:pStyle w:val="Heading3"/>
+      </w:pPr>
+      <w:r>
+        <w:t>4.3 Phase B — prompt ablation (120 goals, fixed ACJ models)</w:t>
+      </w:r>
+    </w:p>
+    <w:p>
+      <w:r>
+        <w:t>Models fixed to: llama3.1:8b | qwen2.5:7b-instruct | qwen2.5:7b-instruct. The only axis varied is prompt_style (prompt_version=v1).</w:t>
+      </w:r>
+    </w:p>
+    <w:p>
+      <w:pPr>
+        <w:pStyle w:val="ListBullet"/>
+      </w:pPr>
+      <w:r>
+        <w:t>Cached inputs: copilot-v2/artifacts/evals/38710839ca6e1009/debate_replay/20260415_122444/specialist_inputs.jsonl</w:t>
+      </w:r>
+    </w:p>
+    <w:p>
+      <w:pPr>
+        <w:pStyle w:val="ListBullet"/>
+      </w:pPr>
+      <w:r>
+        <w:t>Outputs: .../prompt_ablation_llama_qwen_qwen/&lt;style&gt;_v1/summary.json</w:t>
+      </w:r>
+    </w:p>
+    <w:tbl>
+      <w:tblPr>
+        <w:tblStyle w:val="TableGrid"/>
+        <w:tblW w:type="auto" w:w="0"/>
+        <w:tblLook w:firstColumn="1" w:firstRow="1" w:lastColumn="0" w:lastRow="0" w:noHBand="0" w:noVBand="1" w:val="04A0"/>
+      </w:tblPr>
+      <w:tblGrid>
+        <w:gridCol w:w="1440"/>
+        <w:gridCol w:w="1440"/>
+        <w:gridCol w:w="1440"/>
+        <w:gridCol w:w="1440"/>
+        <w:gridCol w:w="1440"/>
+        <w:gridCol w:w="1440"/>
+      </w:tblGrid>
+      <w:tr>
+        <w:tc>
+          <w:tcPr>
+            <w:tcW w:type="dxa" w:w="1440"/>
+          </w:tcPr>
+          <w:p>
+            <w:r/>
+            <w:r>
+              <w:t>prompt_style</w:t>
+            </w:r>
+          </w:p>
+        </w:tc>
+        <w:tc>
+          <w:tcPr>
+            <w:tcW w:type="dxa" w:w="1440"/>
+          </w:tcPr>
+          <w:p>
+            <w:r/>
+            <w:r>
+              <w:t>ok_rate</w:t>
+            </w:r>
+          </w:p>
+        </w:tc>
+        <w:tc>
+          <w:tcPr>
+            <w:tcW w:type="dxa" w:w="1440"/>
+          </w:tcPr>
+          <w:p>
+            <w:r/>
+            <w:r>
+              <w:t>conflict_detection</w:t>
+            </w:r>
+          </w:p>
+        </w:tc>
+        <w:tc>
+          <w:tcPr>
+            <w:tcW w:type="dxa" w:w="1440"/>
+          </w:tcPr>
+          <w:p>
+            <w:r/>
+            <w:r>
+              <w:t>decision_justification</w:t>
+            </w:r>
+          </w:p>
+        </w:tc>
+        <w:tc>
+          <w:tcPr>
+            <w:tcW w:type="dxa" w:w="1440"/>
+          </w:tcPr>
+          <w:p>
+            <w:r/>
+            <w:r>
+              <w:t>constraint_respect</w:t>
+            </w:r>
+          </w:p>
+        </w:tc>
+        <w:tc>
+          <w:tcPr>
+            <w:tcW w:type="dxa" w:w="1440"/>
+          </w:tcPr>
+          <w:p>
+            <w:r/>
+            <w:r>
+              <w:t>latency_s_mean</w:t>
+            </w:r>
+          </w:p>
+        </w:tc>
+      </w:tr>
+      <w:tr>
+        <w:tc>
+          <w:tcPr>
+            <w:tcW w:type="dxa" w:w="1440"/>
+          </w:tcPr>
+          <w:p>
+            <w:r/>
+            <w:r>
+              <w:t>zero_shot_json</w:t>
+            </w:r>
+          </w:p>
+        </w:tc>
+        <w:tc>
+          <w:tcPr>
+            <w:tcW w:type="dxa" w:w="1440"/>
+          </w:tcPr>
+          <w:p>
+            <w:r/>
+            <w:r>
+              <w:t>1.00</w:t>
+            </w:r>
+          </w:p>
+        </w:tc>
+        <w:tc>
+          <w:tcPr>
+            <w:tcW w:type="dxa" w:w="1440"/>
+          </w:tcPr>
+          <w:p>
+            <w:r/>
+            <w:r>
+              <w:t>0.758</w:t>
+            </w:r>
+          </w:p>
+        </w:tc>
+        <w:tc>
+          <w:tcPr>
+            <w:tcW w:type="dxa" w:w="1440"/>
+          </w:tcPr>
+          <w:p>
+            <w:r/>
+            <w:r>
+              <w:t>0.975</w:t>
+            </w:r>
+          </w:p>
+        </w:tc>
+        <w:tc>
+          <w:tcPr>
+            <w:tcW w:type="dxa" w:w="1440"/>
+          </w:tcPr>
+          <w:p>
+            <w:r/>
+            <w:r>
+              <w:t>0.746</w:t>
+            </w:r>
+          </w:p>
+        </w:tc>
+        <w:tc>
+          <w:tcPr>
+            <w:tcW w:type="dxa" w:w="1440"/>
+          </w:tcPr>
+          <w:p>
+            <w:r/>
+            <w:r>
+              <w:t>20.9</w:t>
+            </w:r>
+          </w:p>
+        </w:tc>
+      </w:tr>
+      <w:tr>
+        <w:tc>
+          <w:tcPr>
+            <w:tcW w:type="dxa" w:w="1440"/>
+          </w:tcPr>
+          <w:p>
+            <w:r/>
+            <w:r>
+              <w:t>few_shot_json</w:t>
+            </w:r>
+          </w:p>
+        </w:tc>
+        <w:tc>
+          <w:tcPr>
+            <w:tcW w:type="dxa" w:w="1440"/>
+          </w:tcPr>
+          <w:p>
+            <w:r/>
+            <w:r>
+              <w:t>1.00</w:t>
+            </w:r>
+          </w:p>
+        </w:tc>
+        <w:tc>
+          <w:tcPr>
+            <w:tcW w:type="dxa" w:w="1440"/>
+          </w:tcPr>
+          <w:p>
+            <w:r/>
+            <w:r>
+              <w:t>0.592</w:t>
+            </w:r>
+          </w:p>
+        </w:tc>
+        <w:tc>
+          <w:tcPr>
+            <w:tcW w:type="dxa" w:w="1440"/>
+          </w:tcPr>
+          <w:p>
+            <w:r/>
+            <w:r>
+              <w:t>0.994</w:t>
+            </w:r>
+          </w:p>
+        </w:tc>
+        <w:tc>
+          <w:tcPr>
+            <w:tcW w:type="dxa" w:w="1440"/>
+          </w:tcPr>
+          <w:p>
+            <w:r/>
+            <w:r>
+              <w:t>0.964</w:t>
+            </w:r>
+          </w:p>
+        </w:tc>
+        <w:tc>
+          <w:tcPr>
+            <w:tcW w:type="dxa" w:w="1440"/>
+          </w:tcPr>
+          <w:p>
+            <w:r/>
+            <w:r>
+              <w:t>21.0</w:t>
+            </w:r>
+          </w:p>
+        </w:tc>
+      </w:tr>
+      <w:tr>
+        <w:tc>
+          <w:tcPr>
+            <w:tcW w:type="dxa" w:w="1440"/>
+          </w:tcPr>
+          <w:p>
+            <w:r/>
+            <w:r>
+              <w:t>structured_rationale</w:t>
+            </w:r>
+          </w:p>
+        </w:tc>
+        <w:tc>
+          <w:tcPr>
+            <w:tcW w:type="dxa" w:w="1440"/>
+          </w:tcPr>
+          <w:p>
+            <w:r/>
+            <w:r>
+              <w:t>1.00</w:t>
+            </w:r>
+          </w:p>
+        </w:tc>
+        <w:tc>
+          <w:tcPr>
+            <w:tcW w:type="dxa" w:w="1440"/>
+          </w:tcPr>
+          <w:p>
+            <w:r/>
+            <w:r>
+              <w:t>0.750</w:t>
+            </w:r>
+          </w:p>
+        </w:tc>
+        <w:tc>
+          <w:tcPr>
+            <w:tcW w:type="dxa" w:w="1440"/>
+          </w:tcPr>
+          <w:p>
+            <w:r/>
+            <w:r>
+              <w:t>0.983</w:t>
+            </w:r>
+          </w:p>
+        </w:tc>
+        <w:tc>
+          <w:tcPr>
+            <w:tcW w:type="dxa" w:w="1440"/>
+          </w:tcPr>
+          <w:p>
+            <w:r/>
+            <w:r>
+              <w:t>0.799</w:t>
+            </w:r>
+          </w:p>
+        </w:tc>
+        <w:tc>
+          <w:tcPr>
+            <w:tcW w:type="dxa" w:w="1440"/>
+          </w:tcPr>
+          <w:p>
+            <w:r/>
+            <w:r>
+              <w:t>21.1</w:t>
+            </w:r>
+          </w:p>
+        </w:tc>
+      </w:tr>
+      <w:tr>
+        <w:tc>
+          <w:tcPr>
+            <w:tcW w:type="dxa" w:w="1440"/>
+          </w:tcPr>
+          <w:p>
+            <w:r/>
+            <w:r>
+              <w:t>cot_hidden</w:t>
+            </w:r>
+          </w:p>
+        </w:tc>
+        <w:tc>
+          <w:tcPr>
+            <w:tcW w:type="dxa" w:w="1440"/>
+          </w:tcPr>
+          <w:p>
+            <w:r/>
+            <w:r>
+              <w:t>1.00</w:t>
+            </w:r>
+          </w:p>
+        </w:tc>
+        <w:tc>
+          <w:tcPr>
+            <w:tcW w:type="dxa" w:w="1440"/>
+          </w:tcPr>
+          <w:p>
+            <w:r/>
+            <w:r>
+              <w:t>0.733</w:t>
+            </w:r>
+          </w:p>
+        </w:tc>
+        <w:tc>
+          <w:tcPr>
+            <w:tcW w:type="dxa" w:w="1440"/>
+          </w:tcPr>
+          <w:p>
+            <w:r/>
+            <w:r>
+              <w:t>0.953</w:t>
+            </w:r>
+          </w:p>
+        </w:tc>
+        <w:tc>
+          <w:tcPr>
+            <w:tcW w:type="dxa" w:w="1440"/>
+          </w:tcPr>
+          <w:p>
+            <w:r/>
+            <w:r>
+              <w:t>0.847</w:t>
+            </w:r>
+          </w:p>
+        </w:tc>
+        <w:tc>
+          <w:tcPr>
+            <w:tcW w:type="dxa" w:w="1440"/>
+          </w:tcPr>
+          <w:p>
+            <w:r/>
+            <w:r>
+              <w:t>7.8</w:t>
+            </w:r>
+          </w:p>
+        </w:tc>
+      </w:tr>
+    </w:tbl>
+    <w:p>
+      <w:r>
+        <w:t>Interpretation: few_shot_json improves constraint_respect at the cost of conflict_detection on this rubric; cot_hidden sits between zero-shot and few-shot on constraints/conflict. Treat latency as session-dependent; rubric columns are the fair cross-style comparison.</w:t>
+      </w:r>
+    </w:p>
+    <w:p>
+      <w:pPr>
+        <w:pStyle w:val="Heading2"/>
+      </w:pPr>
+      <w:r>
+        <w:t>5. Changelog</w:t>
       </w:r>
     </w:p>
     <w:tbl>
@@ -9340,6 +9822,28 @@
           <w:p>
             <w:r>
               <w:t>**VADER** val threshold tuning + **two-phase linspace exploration**; canonical **`vader_tune_report.json`**; best cutoffs **−0.11 / +0.3575**; test metrics **`metrics_vader_slice_10k_best_explored.json`** (coarse grid artifact: `metrics_vader_slice_10k_val_tuned_thresh.json`). §3.2–3.4 updated.</w:t>
+            </w:r>
+          </w:p>
+        </w:tc>
+      </w:tr>
+      <w:tr>
+        <w:tc>
+          <w:tcPr>
+            <w:tcW w:type="dxa" w:w="4320"/>
+          </w:tcPr>
+          <w:p>
+            <w:r>
+              <w:t>2026-04-15</w:t>
+            </w:r>
+          </w:p>
+        </w:tc>
+        <w:tc>
+          <w:tcPr>
+            <w:tcW w:type="dxa" w:w="4320"/>
+          </w:tcPr>
+          <w:p>
+            <w:r>
+              <w:t>Debate §4.3: Phase B prompt ablation (120 goals, fixed ACJ models) including cot_hidden; demo default few_shot_json / v1 via server env.</w:t>
             </w:r>
           </w:p>
         </w:tc>

</xml_diff>